<commit_message>
updated the new model
</commit_message>
<xml_diff>
--- a/uploads/infosys_CAM.docx
+++ b/uploads/infosys_CAM.docx
@@ -25,27 +25,27 @@
     </w:p>
     <w:p>
       <w:r>
-        <w:t>revenue: 0</w:t>
+        <w:t>revenue: 12000000000</w:t>
       </w:r>
     </w:p>
     <w:p>
       <w:r>
-        <w:t>net_profit: 0</w:t>
+        <w:t>net_profit: 850000000</w:t>
       </w:r>
     </w:p>
     <w:p>
       <w:r>
-        <w:t>total_debt: 0</w:t>
+        <w:t>total_debt: 6000000000</w:t>
       </w:r>
     </w:p>
     <w:p>
       <w:r>
-        <w:t>total_assets: 0</w:t>
+        <w:t>total_assets: 20000000000</w:t>
       </w:r>
     </w:p>
     <w:p>
       <w:r>
-        <w:t>total_liabilities: 0</w:t>
+        <w:t>total_liabilities: 11000000000</w:t>
       </w:r>
     </w:p>
     <w:p>
@@ -54,6 +54,21 @@
       </w:pPr>
       <w:r>
         <w:t>Financial Ratios</w:t>
+      </w:r>
+    </w:p>
+    <w:p>
+      <w:r>
+        <w:t>profit_margin: 0.071</w:t>
+      </w:r>
+    </w:p>
+    <w:p>
+      <w:r>
+        <w:t>debt_ratio: 0.3</w:t>
+      </w:r>
+    </w:p>
+    <w:p>
+      <w:r>
+        <w:t>leverage: 0.545</w:t>
       </w:r>
     </w:p>
     <w:p>
@@ -66,7 +81,7 @@
     </w:p>
     <w:p>
       <w:r>
-        <w:t>Risk Score: 85</w:t>
+        <w:t>Risk Score: 100</w:t>
       </w:r>
     </w:p>
     <w:p>

</xml_diff>